<commit_message>
Finalize manuscript bundle metadata and app overhaul mapping
</commit_message>
<xml_diff>
--- a/docs/manuscripts/target_journal_packages/jamia_open_submission/cover_letter_jamia_open.docx
+++ b/docs/manuscripts/target_journal_packages/jamia_open_submission/cover_letter_jamia_open.docx
@@ -201,13 +201,7 @@
         <w:pStyle w:val="BodyText"/>
       </w:pPr>
       <w:r>
-        <w:t xml:space="preserve">[Corresponding author name]</w:t>
-      </w:r>
-      <w:r>
-        <w:br/>
-      </w:r>
-      <w:r>
-        <w:t xml:space="preserve">on behalf of all authors</w:t>
+        <w:t xml:space="preserve">Dr. Siddalingaiah H S</w:t>
       </w:r>
     </w:p>
     <w:bookmarkEnd w:id="9"/>

</xml_diff>